<commit_message>
Added documentation folder and updated project files
</commit_message>
<xml_diff>
--- a/MERN Phase Wise-20260616T114850Z-3-001/MERN Phase Wise/Phase Wise Templets/Project Development/User Acceptance Testing FSD.docx
+++ b/MERN Phase Wise-20260616T114850Z-3-001/MERN Phase Wise/Phase Wise Templets/Project Development/User Acceptance Testing FSD.docx
@@ -326,22 +326,40 @@
     </w:p>
     <w:p>
       <w:r>
-        <w:t>Project Name: [Enter Project Name]</w:t>
+        <w:t xml:space="preserve">Project Name: </w:t>
+      </w:r>
+      <w:r>
+        <w:t>House Rent</w:t>
       </w:r>
     </w:p>
     <w:p>
       <w:r>
-        <w:t>Project Description: [Brief Description of the Project]</w:t>
+        <w:t xml:space="preserve">Project Description: </w:t>
+      </w:r>
+      <w:r>
+        <w:t>A full-stack web application that streamlines house rental management by allowing property owners to list properties, renters to search and book houses, and administrators to manage the platform efficiently.</w:t>
       </w:r>
     </w:p>
     <w:p>
       <w:r>
-        <w:t>Project Version: [Version Number]</w:t>
+        <w:t xml:space="preserve">Project Version: </w:t>
+      </w:r>
+      <w:r>
+        <w:t>v1.0.0</w:t>
       </w:r>
     </w:p>
     <w:p>
       <w:r>
-        <w:t>Testing Period: [Start Date] to [End Date]</w:t>
+        <w:t xml:space="preserve">Testing Period: </w:t>
+      </w:r>
+      <w:r>
+        <w:t xml:space="preserve">14 June </w:t>
+      </w:r>
+      <w:r>
+        <w:t xml:space="preserve"> to </w:t>
+      </w:r>
+      <w:r>
+        <w:t xml:space="preserve"> 16 June</w:t>
       </w:r>
     </w:p>
     <w:p>
@@ -361,12 +379,12 @@
     </w:p>
     <w:p>
       <w:r>
-        <w:t>[List of Features and Functionalities to be Tested]</w:t>
+        <w:t>1)Register and login.</w:t>
       </w:r>
     </w:p>
     <w:p>
       <w:r>
-        <w:t>[List of User Stories or Requirements to be Tested]</w:t>
+        <w:t>2)Adding property,deleting property and negotiation.</w:t>
       </w:r>
     </w:p>
     <w:p>
@@ -386,12 +404,10 @@
     </w:p>
     <w:p>
       <w:r>
-        <w:t>URL/Location: [Web URL or Application Location]</w:t>
-      </w:r>
-    </w:p>
-    <w:p>
-      <w:r>
-        <w:t>Credentials (if required): [Username/Password]</w:t>
+        <w:t xml:space="preserve">URL/Location: </w:t>
+      </w:r>
+      <w:r>
+        <w:t>http://localhost:5173/</w:t>
       </w:r>
     </w:p>
     <w:p>
@@ -607,19 +623,11 @@
                 <w:rFonts w:ascii="Calibri" w:eastAsia="Calibri" w:hAnsi="Calibri" w:cs="Calibri"/>
               </w:rPr>
             </w:pPr>
-            <w:proofErr w:type="gramStart"/>
             <w:r>
               <w:rPr>
                 <w:rFonts w:ascii="Calibri" w:eastAsia="Calibri" w:hAnsi="Calibri" w:cs="Calibri"/>
               </w:rPr>
-              <w:t>A</w:t>
-            </w:r>
-            <w:proofErr w:type="gramEnd"/>
-            <w:r>
-              <w:rPr>
-                <w:rFonts w:ascii="Calibri" w:eastAsia="Calibri" w:hAnsi="Calibri" w:cs="Calibri"/>
-              </w:rPr>
-              <w:t xml:space="preserve"> owner trying to add his property</w:t>
+              <w:t>A owner trying to add his property</w:t>
             </w:r>
           </w:p>
         </w:tc>
@@ -648,15 +656,7 @@
               </w:numPr>
             </w:pPr>
             <w:r>
-              <w:t xml:space="preserve">Add </w:t>
-            </w:r>
-            <w:proofErr w:type="gramStart"/>
-            <w:r>
-              <w:t>an</w:t>
-            </w:r>
-            <w:proofErr w:type="gramEnd"/>
-            <w:r>
-              <w:t xml:space="preserve"> property</w:t>
+              <w:t>Add an property</w:t>
             </w:r>
           </w:p>
         </w:tc>

</xml_diff>